<commit_message>
Rewrite Chapter One on 2021-2026 peer-reviewed sources; trim to 19pp; add --chapter-one build mode
- Chapter One regenerated with global->Africa->Tanzania->Lushoto flow, PEEL
  paragraphs, gender-disaggregated census data and 2021-2026 evidence
  (Ba 2021; Masvaure & Fish 2022; Kacou et al. 2022; Mabizela & Zwane 2023;
  Herman 2023; Kwareh et al. 2024; Rugeiyamu 2024; Ochen-Ochen 2025;
  Mwaijande et al. 2026; CAG 2026)
- Chapters Two and Three re-anchored to the same source set; retired six
  superseded pre-2021 items
- Reference list rebuilt in APA 7th (25 sources, guide range 20-25)
- Length trimmed to 19 pages (guide range 15-20)
- build_proposal.py: --chapter-one emits a standalone Chapter One DOCX whose
  reference list is limited to the 18 works Chapter One actually cites

Co-authored-by: arena-agent <297053741+arena-agent@users.noreply.github.com>
</commit_message>
<xml_diff>
--- a/M&E System and Local Government Project Performance - Lushoto District - Research Proposal.docx
+++ b/M&E System and Local Government Project Performance - Lushoto District - Research Proposal.docx
@@ -226,7 +226,7 @@
           <w:color w:val="000000"/>
           <w:sz w:val="24"/>
         </w:rPr>
-        <w:t>Public investment in local infrastructure is how devolved governments convert public resources into services. Whether such investment is completed on schedule, within budget, to technical standard and put to sustained use depends largely on the quality of the accompanying monitoring and evaluation (M&amp;E) system, which combines the institutions, human resources, indicators, tools and mechanisms for using information in decision making (Kusek and Rist, 2004).</w:t>
+        <w:t>Governments and development partners have placed monitoring and evaluation (M&amp;E) at the centre of public project management since the 1990s. Kusek and Rist (2004) presented the results-based M&amp;E system as the route through which a government tracks implementation, learns from experience and improves the use of public resources. Ba (2021) reported that the World Bank assessment of 2007 found little effectiveness in such systems, and Kacou et al. (2022) concluded from fifty years of capacity building research that a formal system alone does not produce results, because context, demand and use determine performance. The global evidence therefore shows that the presence of an M&amp;E system does not guarantee project performance.</w:t>
       </w:r>
     </w:p>
     <w:p>
@@ -244,47 +244,7 @@
           <w:color w:val="000000"/>
           <w:sz w:val="24"/>
         </w:rPr>
-        <w:t xml:space="preserve">Results-based management has become the dominant global paradigm, moving governments from measuring inputs to measuring results and correcting deviations before they become losses (Kusek and Rist, 2004; OECD, 2010). In sub-Saharan Africa devolution has shifted service delivery to local governments with fragile M&amp;E structures: Okeyo </w:t>
-      </w:r>
-      <w:r>
-        <w:rPr>
-          <w:rFonts w:ascii="Times New Roman" w:hAnsi="Times New Roman" w:cs="Times New Roman" w:eastAsia="Times New Roman"/>
-          <w:b w:val="0"/>
-          <w:i/>
-          <w:color w:val="000000"/>
-          <w:sz w:val="24"/>
-        </w:rPr>
-        <w:t>et al.</w:t>
-      </w:r>
-      <w:r>
-        <w:rPr>
-          <w:rFonts w:ascii="Times New Roman" w:hAnsi="Times New Roman" w:cs="Times New Roman" w:eastAsia="Times New Roman"/>
-          <w:b w:val="0"/>
-          <w:i w:val="0"/>
-          <w:color w:val="000000"/>
-          <w:sz w:val="24"/>
-        </w:rPr>
-        <w:t xml:space="preserve"> (2019) found that Kenyan county organograms provided no M&amp;E offices, and Chebet Murei </w:t>
-      </w:r>
-      <w:r>
-        <w:rPr>
-          <w:rFonts w:ascii="Times New Roman" w:hAnsi="Times New Roman" w:cs="Times New Roman" w:eastAsia="Times New Roman"/>
-          <w:b w:val="0"/>
-          <w:i/>
-          <w:color w:val="000000"/>
-          <w:sz w:val="24"/>
-        </w:rPr>
-        <w:t>et al.</w:t>
-      </w:r>
-      <w:r>
-        <w:rPr>
-          <w:rFonts w:ascii="Times New Roman" w:hAnsi="Times New Roman" w:cs="Times New Roman" w:eastAsia="Times New Roman"/>
-          <w:b w:val="0"/>
-          <w:i w:val="0"/>
-          <w:color w:val="000000"/>
-          <w:sz w:val="24"/>
-        </w:rPr>
-        <w:t xml:space="preserve"> (2017) that M&amp;E human resource capacity determined the performance of horticulture projects in Nakuru County.</w:t>
+        <w:t>Sub-Saharan Africa has supplied the clearest evidence of the gap between formal systems and actual performance. Masvaure and Fish (2022) studied M&amp;E capacity strengthening in eight African countries, including Tanzania, and found that the initiatives remained ad hoc and focused on individual skills rather than on organisational systems. Mabizela and Zwane (2023) established in three South African district municipalities that the absence of a functional M&amp;E system contributed directly to weak service delivery. Ochen-Ochen (2025) observed in Western Uganda that M&amp;E generated the evidence which donors required but produced little local use, and that political leaders sought participation in monitoring for political capital. African local governments therefore face institutional, human resource and political constraints at the same time.</w:t>
       </w:r>
     </w:p>
     <w:p>
@@ -302,7 +262,7 @@
           <w:color w:val="000000"/>
           <w:sz w:val="24"/>
         </w:rPr>
-        <w:t>In Tanzania, Decentralisation by Devolution (D by D) was adopted in 2000 to bring decision making, resources and services closer to the people (United Republic of Tanzania [URT], 2000). Under the Local Government (District Authorities) Act No. 7 of 1982 district councils plan, implement, supervise and evaluate local projects (URT, 1982), while PO-RALG provides oversight. Audit evidence shows persistent weakness: in the reports tabled in April 2026 the Controller and Auditor General found that only 36.7% of the 38,181 recommendations issued in previous years had been implemented and that local government authorities (LGAs) continued to record delayed projects, payments for incomplete works, weak contract management and inadequate supervision (Office of the Controller and Auditor General [CAG], 2026). Tanzanian studies attribute such outcomes to weak M&amp;E plans, unskilled staff and political interference (Mhina, 2017; Maimula, 2017), while Herman (2023) and Killo (2022) respectively confirmed the significance of M&amp;E planning for water projects in Dodoma City Council and of M&amp;E human resource capacity and stakeholder involvement for projects in Katavi Region.</w:t>
+        <w:t>Tanzania has built the legal and institutional framework for M&amp;E, yet implementation remains weak. The Local Government (District Authorities) Act No. 7 of 1982 gave district councils the mandate to plan, implement, supervise and evaluate local projects (United Republic of Tanzania [URT], 1982), and the National Policy on Decentralisation by Devolution of 2000 transferred resources and decision making to those councils under the oversight of the President's Office – Regional Administration and Local Government (PO-RALG) (URT, 2000). Mwaijande et al. (2026) confirmed that Tanzania has established a Directorate of Performance Monitoring and Evaluation in the Prime Minister's Office and M&amp;E units in ministries and local government authorities (LGAs), but that institutionalisation remains constrained by limited evaluation capacity, weak demand for evidence and the absence of a national evaluation policy. Rugeiyamu (2024) attributed the limited contribution of LGAs to Development Vision 2025 to dependence on central government, weak financial management capacity and inadequate human resources, and reported that ten LGAs held completed but non-operational projects worth TZS 3.31 billion in 2021/22 while 87 LGAs delayed project completion. Audit reports tabled in April 2026 showed that only 36.7 per cent of the 38,181 recommendations issued in previous years had been implemented and that LGAs continued to record delayed projects and weak contract management (Office of the Controller and Auditor General [CAG], 2026). Tanzania therefore has a system which exists on paper but which does not consistently correct project performance.</w:t>
       </w:r>
     </w:p>
     <w:p>
@@ -320,27 +280,7 @@
           <w:color w:val="000000"/>
           <w:sz w:val="24"/>
         </w:rPr>
-        <w:t xml:space="preserve">Lushoto District Council is one of the eleven LGAs of Tanga Region. It covers 3,297 square kilometres in the Usambara Mountains and had 350,958 residents in the 2022 census (National Bureau of Statistics [NBS], 2022); the 2012 census recorded 332,436 people, of whom 153,847 (46.3%) were men and 178,589 (53.7%) were women, in 71,009 households, 71.4% of them in villages (Lushoto District Council, 2015). Its Strategic Plan for 2015/16-2019/20 prioritised health, water, education and road infrastructure and set a target of raising management and governance systems from 55% to 60%, financing coming mainly through earmarked central grants and own-source revenue (Lyon </w:t>
-      </w:r>
-      <w:r>
-        <w:rPr>
-          <w:rFonts w:ascii="Times New Roman" w:hAnsi="Times New Roman" w:cs="Times New Roman" w:eastAsia="Times New Roman"/>
-          <w:b w:val="0"/>
-          <w:i/>
-          <w:color w:val="000000"/>
-          <w:sz w:val="24"/>
-        </w:rPr>
-        <w:t>et al.</w:t>
-      </w:r>
-      <w:r>
-        <w:rPr>
-          <w:rFonts w:ascii="Times New Roman" w:hAnsi="Times New Roman" w:cs="Times New Roman" w:eastAsia="Times New Roman"/>
-          <w:b w:val="0"/>
-          <w:i w:val="0"/>
-          <w:color w:val="000000"/>
-          <w:sz w:val="24"/>
-        </w:rPr>
-        <w:t>, 2017). Council reports indicate time and cost overruns, stalled works and participation confined to project identification.</w:t>
+        <w:t>Lushoto District Council presents this national pattern at the local level. The council covers 3,297 square kilometres in the Usambara Mountains and served 350,958 residents in the 2022 Population and Housing Census (National Bureau of Statistics [NBS], 2022). The 2012 census recorded 332,436 people, of whom 153,847 (46.3 per cent) were men and 178,589 (53.7 per cent) were women, in 71,009 households, 71.4 per cent of which were rural (Lushoto District Council, 2015). Its District Strategic Plan for 2015/16 to 2019/20 prioritised health, water, education and roads and set a target of raising management and governance systems from 55 to 60 per cent (Lushoto District Council, 2015). The council finances its water schemes, classrooms, health facilities, roads and markets through earmarked central grants, sector funds and own-source revenue. Women and children therefore bear the greatest cost when a project stalls or when a completed facility remains unused, and no systematic study has yet measured the influence of M&amp;E practices on the performance of these projects in Lushoto District.</w:t>
       </w:r>
     </w:p>
     <w:p>
@@ -376,7 +316,7 @@
           <w:color w:val="000000"/>
           <w:sz w:val="24"/>
         </w:rPr>
-        <w:t>Ideally, Lushoto District Council should deliver its projects – water schemes, classrooms, health facilities, roads and markets – on schedule, within budget and to technical standards, with completed facilities used and maintained by beneficiaries. That requires a functioning M&amp;E system: an approved plan with baselines, indicators and targets; qualified staff; and the systematic involvement of councillors, ward and village authorities, contractors and beneficiaries in monitoring and in the use of findings (URT, 2000).</w:t>
+        <w:t>A district council should deliver its projects on schedule, within budget and to the required technical standards, and the completed facilities should serve the intended beneficiaries for their designed life. This outcome requires a functioning M&amp;E system. The council should prepare an M&amp;E plan which states baselines, indicators, targets, responsibilities and budgets; it should employ qualified and trained M&amp;E staff; and it should involve councillors, ward and village authorities, contractors and beneficiaries in monitoring and in the use of findings (Kusek &amp; Rist, 2004; URT, 2000). Herman (2023) confirmed this expectation in Dodoma City Council, where M&amp;E planning significantly affected the performance of water supply projects.</w:t>
       </w:r>
     </w:p>
     <w:p>
@@ -394,7 +334,7 @@
           <w:color w:val="000000"/>
           <w:sz w:val="24"/>
         </w:rPr>
-        <w:t>In reality, council projects record delays, cost overruns, substandard or abandoned works and low post-completion utilisation. Audit reports tabled in April 2026 show that only 36.7% of 38,181 previous recommendations had been implemented and that LGAs recorded delayed projects, payments for incomplete works and weak contract management (CAG, 2026), outcomes attributed to weak M&amp;E planning, untrained M&amp;E human resources and the exclusion of stakeholders from M&amp;E (Mhina, 2017; Maimula, 2017; Herman, 2023; Killo, 2022). In Lushoto the M&amp;E function is coordinated through the planning structure while sector departments supervise projects, and participation is largely limited to project identification, yet no systematic study has quantified how much of this deficit is explained by M&amp;E planning practices, M&amp;E human resource capacity and stakeholder involvement in M&amp;E.</w:t>
+        <w:t>The reality in Tanzanian councils falls short of this standard. Kwareh et al. (2024) reported that a health project in Dodoma and Dar es Salaam used standard M&amp;E tools (84.5 per cent), reporting (73.2 per cent), site visits (67.6 per cent) and supportive supervision (57.7 per cent), while participatory monitoring reached only 39.4 per cent. Killo (2022) identified M&amp;E human resource capacity and technical expertise as the strongest influences on project performance in Katavi Region. In Lushoto District Council the M&amp;E function operates through the planning structure, sector departments supervise their own projects, and community participation remains largely confined to project identification. Council reports and audit findings record delayed works, cost overruns and under-used facilities, yet no study has quantified the extent to which M&amp;E planning practices, M&amp;E human resource capacity and stakeholder involvement in M&amp;E explain the performance of local government projects in this council.</w:t>
       </w:r>
     </w:p>
     <w:p>
@@ -412,7 +352,7 @@
           <w:color w:val="000000"/>
           <w:sz w:val="24"/>
         </w:rPr>
-        <w:t>If the situation persists, public resources will keep being committed to projects delivered late, at higher cost and of questionable quality, undermining the Council's ability to meet national plan targets (URT, 2021) and its own strategic plan objectives, weakening citizen confidence in devolved government and perpetuating service gaps for the district's 350,958 residents (NBS, 2022), a large proportion of whom are women and children in rural wards. The study will therefore assess the impact of the M&amp;E system on the performance of local government projects in Lushoto District Council.</w:t>
+        <w:t>If this situation persists, the council will continue to commit public resources to projects which are delivered late, which cost more than planned and which fail to serve the population that requested them. Rugeiyamu (2024) warned that such weaknesses limit the contribution of LGAs to national development goals, and the CAG (2026) reported that unimplemented audit recommendations persist for years. The consequences will fall most heavily on rural women and children, who depend on water points, health facilities and classrooms, and they will weaken public confidence in devolved government. The study will therefore assess the impact of the M&amp;E system on the performance of local government projects in Lushoto District Council.</w:t>
       </w:r>
     </w:p>
     <w:p>
@@ -448,7 +388,7 @@
           <w:color w:val="000000"/>
           <w:sz w:val="24"/>
         </w:rPr>
-        <w:t>The study will convert a generalised concern about poor project delivery into measurable evidence on three M&amp;E dimensions that council management can act upon. The management team, planning and sector departments and the internal audit unit will learn where M&amp;E planning, staffing and participation require strengthening and will gain a basis for answering audit recommendations. PO-RALG and the Tanga Regional Secretariat will obtain evidence for targeting capacity building and oversight to rural councils. Citizens, ward and village authorities and project committees will benefit from improved transparency, ownership and value for money. Academically, the study will fill a contextual gap, since most Tanzanian evidence comes from cities, non-governmental organisations or single sectors rather than from a rural mountain council, and it will test agency and stakeholder propositions in a devolved setting.</w:t>
+        <w:t>The study will benefit several groups, and it will contribute to knowledge. The Council Director, the planning and M&amp;E unit, the sector departments and the internal audit unit will receive evidence on the M&amp;E dimensions which most affect project performance, and they will use it to answer audit recommendations and to improve supervision. PO-RALG and the Tanga Regional Secretariat will obtain council-level evidence for the targeting of capacity building and oversight to rural councils, and the Local Government Training Institute will gain material for M&amp;E short courses (Mwaijande et al., 2026). Citizens, ward and village authorities and project committees will benefit from greater transparency, ownership and value for money. Academically, the study will fill a contextual gap, because most Tanzanian evidence comes from cities, from single sectors or from non-governmental organisations rather than from a rural mountain district council, and it will add to the African literature on M&amp;E institutionalisation.</w:t>
       </w:r>
     </w:p>
     <w:p>
@@ -574,7 +514,7 @@
           <w:color w:val="000000"/>
           <w:sz w:val="24"/>
         </w:rPr>
-        <w:t>Because the study will use a mixed-methods design, research questions will guide all three objectives while the corresponding hypotheses will be tested on the quantitative strand. RQ1: to what extent do M&amp;E planning practices influence the performance of local government projects in Lushoto District? RQ2: how does M&amp;E human resource capacity influence that performance? RQ3: to what extent does stakeholder involvement in M&amp;E influence that performance?</w:t>
+        <w:t>The study will answer three research questions, and it will test three pairs of hypotheses on the quantitative strand. RQ1: to what extent do M&amp;E planning practices influence the performance of local government projects in Lushoto District? RQ2: how does M&amp;E human resource capacity influence the performance of these projects? RQ3: to what extent does stakeholder involvement in M&amp;E influence the performance of these projects?</w:t>
       </w:r>
     </w:p>
     <w:p>
@@ -592,7 +532,7 @@
           <w:color w:val="000000"/>
           <w:sz w:val="24"/>
         </w:rPr>
-        <w:t>H01: M&amp;E planning practices have no significant influence on the performance of local government projects in Lushoto District (H11: they have a significant positive influence). H02: M&amp;E human resource capacity has no significant influence on that performance (H12: it has a significant positive influence). H03: stakeholder involvement in M&amp;E has no significant influence on that performance (H13: it has a significant positive influence).</w:t>
+        <w:t>H01: M&amp;E planning practices have no significant influence on the performance of local government projects in Lushoto District, against H11: they have a significant positive influence. H02: M&amp;E human resource capacity has no significant influence on that performance, against H12: it has a significant positive influence. H03: stakeholder involvement in M&amp;E has no significant influence on that performance, against H13: it has a significant positive influence.</w:t>
       </w:r>
     </w:p>
     <w:p>
@@ -628,7 +568,7 @@
           <w:color w:val="000000"/>
           <w:sz w:val="24"/>
         </w:rPr>
-        <w:t>In content the study will be confined to the three specific objectives and to project performance measured through timeliness, cost efficiency, technical quality, utilisation and sustainability, and beneficiary satisfaction. Geographically it will cover Lushoto District Council in eight purposively selected wards, and substantively it will cover water, education, health, roads and markets projects implemented in the five financial years from 2021/22 to 2025/26, whether completed, ongoing or stalled.</w:t>
+        <w:t>In content the study will confine itself to the three specific objectives, and it will measure project performance through timeliness, cost efficiency, technical quality, utilisation and sustainability, and beneficiary satisfaction. Geographically it will cover Lushoto District Council in eight purposively selected wards. Substantively it will cover water, education, health, road and market projects which the council implemented in the five financial years from 2021/22 to 2025/26.</w:t>
       </w:r>
     </w:p>
     <w:p>
@@ -646,7 +586,7 @@
           <w:color w:val="000000"/>
           <w:sz w:val="24"/>
         </w:rPr>
-        <w:t>Four limitations are anticipated and will be curbed as follows: reluctance of staff and contractors to disclose information on delayed or defective projects, by guaranteeing anonymity and presenting an introduction letter; recall bias on older projects, by verifying responses against project files and site observation; difficult terrain and poor feeder roads, by scheduling fieldwork in the dry months and clustering wards; and non-response, by maintaining a 10% replacement reserve.</w:t>
+        <w:t>The study anticipates four limitations, and it will curb each of them. Staff and contractors may withhold information on delayed or defective projects, and the researcher will curb this reluctance through guaranteed anonymity and an introduction letter. Respondents may recall older projects inaccurately, and the researcher will verify their responses against project files and site observation. The terrain may slow fieldwork, and the researcher will collect data in the dry months and cluster the wards. Some respondents may fail to answer, and the researcher will keep a replacement reserve of ten per cent from the same strata.</w:t>
       </w:r>
     </w:p>
     <w:p>
@@ -682,7 +622,7 @@
           <w:color w:val="000000"/>
           <w:sz w:val="24"/>
         </w:rPr>
-        <w:t>The framework is derived from the problem analysis and from results-based management, agency and stakeholder theories. M&amp;E planning practices are expected to supply the indicators, baselines and targets against which progress is measured, M&amp;E human resource capacity to determine whether planned monitoring is executed competently, and stakeholder involvement to improve the accuracy, legitimacy and use of M&amp;E information; together they will explain variation in project performance, subject to the intervening conditions shown in Figure 1.</w:t>
+        <w:t>The framework below derives from the problem analysis and rests on results-based management (Kusek &amp; Rist, 2004), agency theory (Eisenhardt, 1989) and stakeholder theory (Freeman, 1984). M&amp;E planning practices will supply the indicators, baselines and targets against which the council measures progress. M&amp;E human resource capacity will determine whether the council executes the planned monitoring competently. Stakeholder involvement will improve the accuracy, the legitimacy and the use of M&amp;E information. The three dimensions will therefore explain variation in project performance, subject to the intervening conditions which Figure 1 shows.</w:t>
       </w:r>
     </w:p>
     <w:p>
@@ -1247,7 +1187,7 @@
           <w:color w:val="000000"/>
           <w:sz w:val="24"/>
         </w:rPr>
-        <w:t>Before fieldwork the researcher will obtain a letter of introduction from the Institute and research permission from PO-RALG, the Tanga Regional Commissioner, the Lushoto District Commissioner and the Council Director. Participation will be voluntary and based on informed consent; anonymity and confidentiality will be guaranteed by omitting names, coding responses and restricting access to data, which will be used solely for academic purposes. No fabricated or plagiarised material will be presented, and findings will be reported back to the Council.</w:t>
+        <w:t>The researcher will obtain a letter of introduction from the Institute and will secure research permission from PO-RALG, the Tanga Regional Commissioner, the Lushoto District Commissioner and the Council Director before fieldwork begins. Participation will be voluntary and will rest on informed consent. The researcher will guarantee anonymity and confidentiality by omitting names, by coding responses and by restricting access to the data. No fabricated or plagiarised material will be presented, and the researcher will report the findings back to the council.</w:t>
       </w:r>
     </w:p>
     <w:p>
@@ -1301,7 +1241,7 @@
           <w:color w:val="000000"/>
           <w:sz w:val="24"/>
         </w:rPr>
-        <w:t>This chapter reviews the literature giving the study its theoretical basis, organised into theoretical literature, empirical literature and policy review, and ends with the gaps the study will address.</w:t>
+        <w:t>This chapter reviews the theoretical literature, the empirical literature and the relevant policies, and it ends with the gaps which the study will address.</w:t>
       </w:r>
     </w:p>
     <w:p>
@@ -1355,27 +1295,7 @@
           <w:color w:val="000000"/>
           <w:sz w:val="24"/>
         </w:rPr>
-        <w:t xml:space="preserve">Monitoring is the continuous collection of data on specified indicators to show progress and the use of funds; evaluation is the systematic assessment of a project against relevance, efficiency, effectiveness, impact and sustainability (OECD, 2010). An M&amp;E system combines the indicators, methods, institutions and processes through which an organisation tracks implementation and assesses results (Kusek and Rist, 2004). M&amp;E planning practices are the front-end design of that function: the plan, baselines, indicators, targets, tools and budget (Herman, 2023). M&amp;E human resource capacity is the number, qualifications, training, experience and analytical skill of M&amp;E staff at individual, organisational and enabling-environment levels (Mackay, 2007; Chebet Murei </w:t>
-      </w:r>
-      <w:r>
-        <w:rPr>
-          <w:rFonts w:ascii="Times New Roman" w:hAnsi="Times New Roman" w:cs="Times New Roman" w:eastAsia="Times New Roman"/>
-          <w:b w:val="0"/>
-          <w:i/>
-          <w:color w:val="000000"/>
-          <w:sz w:val="24"/>
-        </w:rPr>
-        <w:t>et al.</w:t>
-      </w:r>
-      <w:r>
-        <w:rPr>
-          <w:rFonts w:ascii="Times New Roman" w:hAnsi="Times New Roman" w:cs="Times New Roman" w:eastAsia="Times New Roman"/>
-          <w:b w:val="0"/>
-          <w:i w:val="0"/>
-          <w:color w:val="000000"/>
-          <w:sz w:val="24"/>
-        </w:rPr>
-        <w:t>, 2017). Stakeholder involvement in M&amp;E is the participation of beneficiaries, elected leaders, contractors and oversight bodies in data collection, joint site visits and corrective decisions (Mgoba and Kabote, 2020). Project performance is accomplishment against schedule, cost and quality, extended to strategic criteria, stakeholder satisfaction and sustainability (Ika, 2009), and local government projects are investments planned, financed, procured and supervised by a council under the Local Government (District Authorities) Act No. 7 of 1982 (URT, 1982).</w:t>
+        <w:t>Monitoring is the continuous collection of data on specified indicators to show progress and the use of funds, and evaluation is the systematic assessment of a project against relevance, efficiency, effectiveness, impact and sustainability (OECD, 2010). An M&amp;E system combines the indicators, the methods, the institutions and the processes through which an organisation tracks implementation and assesses results (Kusek &amp; Rist, 2004). M&amp;E planning practices are the front-end design of that function, comprising the plan, the baselines, the indicators, the targets, the tools and the budget (Herman, 2023). M&amp;E human resource capacity is the number, the qualifications, the training and the analytical skill of M&amp;E staff (Masvaure &amp; Fish, 2022). Stakeholder involvement in M&amp;E is the participation of beneficiaries, elected leaders, contractors and oversight bodies in data collection, joint site visits and corrective decisions (Mgoba &amp; Kabote, 2020). Project performance is accomplishment against schedule, cost and quality, together with stakeholder satisfaction and sustainability (Ika, 2009). Local government projects are the investments which a council plans, finances, procures and supervises under the Local Government (District Authorities) Act No. 7 of 1982 (URT, 1982).</w:t>
       </w:r>
     </w:p>
     <w:p>
@@ -1411,7 +1331,7 @@
           <w:color w:val="000000"/>
           <w:sz w:val="24"/>
         </w:rPr>
-        <w:t>Results-based management shifts attention from inputs to outputs, outcomes and impact and treats the M&amp;E plan, indicators and use of information as the engine of that shift (Kusek and Rist, 2004; OECD, 2010); it underpins the first objective. Agency theory explains why planning alone is insufficient: each agent in the chain from citizens through the council to contractors holds more information than the principal and may pursue its own interest, so monitoring reduces information asymmetry and agency costs, and the competence of the monitor determines how well it works (Eisenhardt, 1989); this anchors the second objective. Stakeholder theory holds that an organisation must manage the interests of all groups that affect or are affected by its activities, and that their involvement improves the legitimacy, accuracy and use of information (Freeman, 1984); it anchors the third objective, and beneficiaries' participation yields information outsiders cannot obtain (Mgoba and Kabote, 2020). Evaluation capacity theory adds that capacity must be matched by demand for information (Mackay, 2007). The study will be anchored on agency and stakeholder theories, complemented by results-based management and evaluation capacity.</w:t>
+        <w:t>Results-based management shifts attention from inputs to outputs, outcomes and impact, and it treats the M&amp;E plan, the indicators and the use of information as the engine of that shift (Kusek &amp; Rist, 2004). It underpins the first objective. Agency theory explains why planning alone is insufficient: each agent from citizens through the council to contractors holds more information than the principal holds and may pursue its own interest, so monitoring reduces information asymmetry and agency costs, and the competence of the monitor determines how well it works (Eisenhardt, 1989). It anchors the second objective. Stakeholder theory holds that an organisation must manage the interests of all groups which affect or are affected by its activities, and that their involvement improves the legitimacy and the use of information (Freeman, 1984). It anchors the third objective, because beneficiaries' participation yields information which outsiders cannot obtain (Mgoba &amp; Kabote, 2020). The study will be anchored on agency theory and stakeholder theory, complemented by results-based management.</w:t>
       </w:r>
     </w:p>
     <w:p>
@@ -1447,27 +1367,7 @@
           <w:color w:val="000000"/>
           <w:sz w:val="24"/>
         </w:rPr>
-        <w:t xml:space="preserve">On M&amp;E planning, Herman (2023) used a mixed-methods design with 170 respondents selected by the Yamane formula and found that M&amp;E planning significantly affected the performance of water supply projects in Dodoma City Council (p &lt; 0.05); Mhina (2017) reported weak M&amp;E plans, unskilled staff and limited use of reports in Ruvuma district councils; and Okeyo </w:t>
-      </w:r>
-      <w:r>
-        <w:rPr>
-          <w:rFonts w:ascii="Times New Roman" w:hAnsi="Times New Roman" w:cs="Times New Roman" w:eastAsia="Times New Roman"/>
-          <w:b w:val="0"/>
-          <w:i/>
-          <w:color w:val="000000"/>
-          <w:sz w:val="24"/>
-        </w:rPr>
-        <w:t>et al.</w:t>
-      </w:r>
-      <w:r>
-        <w:rPr>
-          <w:rFonts w:ascii="Times New Roman" w:hAnsi="Times New Roman" w:cs="Times New Roman" w:eastAsia="Times New Roman"/>
-          <w:b w:val="0"/>
-          <w:i w:val="0"/>
-          <w:color w:val="000000"/>
-          <w:sz w:val="24"/>
-        </w:rPr>
-        <w:t xml:space="preserve"> (2019) found M&amp;E structure, process, method and policy to be significant predictors of county project performance in six Kenyan counties (F change = 109.403, p &lt; 0.05).</w:t>
+        <w:t>On M&amp;E planning, Herman (2023) used a mixed-methods design with 170 respondents and found that M&amp;E planning significantly affected the performance of water supply projects in Dodoma City Council. Kwareh et al. (2024) examined a health project in Dodoma and Dar es Salaam with 71 respondents and reported strong use of standard M&amp;E tools and reporting but weak participatory monitoring. Mabizela and Zwane (2023) established that the absence of a functional M&amp;E system contributed to weak service delivery in three South African municipalities. These studies treat planning as one composite measure.</w:t>
       </w:r>
     </w:p>
     <w:p>
@@ -1485,27 +1385,7 @@
           <w:color w:val="000000"/>
           <w:sz w:val="24"/>
         </w:rPr>
-        <w:t xml:space="preserve">On M&amp;E human resource capacity, Chebet Murei </w:t>
-      </w:r>
-      <w:r>
-        <w:rPr>
-          <w:rFonts w:ascii="Times New Roman" w:hAnsi="Times New Roman" w:cs="Times New Roman" w:eastAsia="Times New Roman"/>
-          <w:b w:val="0"/>
-          <w:i/>
-          <w:color w:val="000000"/>
-          <w:sz w:val="24"/>
-        </w:rPr>
-        <w:t>et al.</w:t>
-      </w:r>
-      <w:r>
-        <w:rPr>
-          <w:rFonts w:ascii="Times New Roman" w:hAnsi="Times New Roman" w:cs="Times New Roman" w:eastAsia="Times New Roman"/>
-          <w:b w:val="0"/>
-          <w:i w:val="0"/>
-          <w:color w:val="000000"/>
-          <w:sz w:val="24"/>
-        </w:rPr>
-        <w:t xml:space="preserve"> (2017) established that M&amp;E human resource capacity influenced the performance of horticulture projects in Nakuru County; Maimula (2017) found that local government water projects in Mkuranga suffered from political interference, weak M&amp;E teams and unqualified technical staff; and Killo (2022) identified M&amp;E human resource capacity and technical expertise among the strongest influences on project performance in Katavi Region. Capacity is however often proxied by training attendance rather than by competence in indicator design and analysis.</w:t>
+        <w:t>On M&amp;E human resource capacity, Killo (2022) identified M&amp;E human resource capacity and technical expertise among the strongest influences on project performance in Katavi Region. Masvaure and Fish (2022) found that capacity strengthening in eight African programmes remained ad hoc and focused on individual skills rather than on organisational systems. Capacity is therefore often proxied by workshop attendance rather than by competence in indicator design and analysis.</w:t>
       </w:r>
     </w:p>
     <w:p>
@@ -1523,27 +1403,7 @@
           <w:color w:val="000000"/>
           <w:sz w:val="24"/>
         </w:rPr>
-        <w:t xml:space="preserve">On stakeholder involvement, Mgoba and Kabote (2020) demonstrated that participatory M&amp;E significantly improved the achievement of community-based water projects in Tanzania, and Katerengabo </w:t>
-      </w:r>
-      <w:r>
-        <w:rPr>
-          <w:rFonts w:ascii="Times New Roman" w:hAnsi="Times New Roman" w:cs="Times New Roman" w:eastAsia="Times New Roman"/>
-          <w:b w:val="0"/>
-          <w:i/>
-          <w:color w:val="000000"/>
-          <w:sz w:val="24"/>
-        </w:rPr>
-        <w:t>et al.</w:t>
-      </w:r>
-      <w:r>
-        <w:rPr>
-          <w:rFonts w:ascii="Times New Roman" w:hAnsi="Times New Roman" w:cs="Times New Roman" w:eastAsia="Times New Roman"/>
-          <w:b w:val="0"/>
-          <w:i w:val="0"/>
-          <w:color w:val="000000"/>
-          <w:sz w:val="24"/>
-        </w:rPr>
-        <w:t xml:space="preserve"> (2023), using 400 household heads, found that households' involvement in implementing the M&amp;E plan significantly influenced the performance of the Tanzania Conditional Cash Transfer project (t = 8.472, p &lt; 0.001). These studies concern community-managed projects rather than council capital projects, and measure involvement as meeting attendance rather than influence over monitoring decisions.</w:t>
+        <w:t>On stakeholder involvement, Mgoba and Kabote (2020) demonstrated that participatory M&amp;E improved the achievement of community-based water projects in Tanzania, and Katerengabo et al. (2023) found that households' involvement in implementing the M&amp;E plan significantly influenced the performance of the Tanzania Conditional Cash Transfer project (t = 8.472, p &lt; 0.001). Ochen-Ochen (2025) observed, however, that political leaders join monitoring for political capital and that M&amp;E evidence serves donors more than local users.</w:t>
       </w:r>
     </w:p>
     <w:p>
@@ -1561,7 +1421,7 @@
           <w:color w:val="000000"/>
           <w:sz w:val="24"/>
         </w:rPr>
-        <w:t>Four gaps emerge. Contextually, no published study examines the impact of the M&amp;E system on the performance of local government projects in Lushoto District or in any council of Tanga Region. Conceptually, M&amp;E is usually treated as one composite variable, leaving the separate contributions of planning, human resource capacity and stakeholder involvement unquantified, and performance is often measured by perception rather than by schedule, cost and quality. Methodologically, most studies are single-method surveys whose results cannot be verified against project records or physical works. The study will address these gaps by disaggregating the M&amp;E system into three measurable dimensions, measuring performance on five indicators verified through documents and site observation, and combining regression with qualitative enquiry in one council.</w:t>
+        <w:t>Four gaps emerge. Contextually, no published study examines the impact of the M&amp;E system on the performance of local government projects in Lushoto District or in any council of Tanga Region. Conceptually, scholars treat M&amp;E as one composite variable and leave the separate contributions of planning, human resource capacity and stakeholder involvement unquantified. Methodologically, most studies rely on a single method and cannot verify perceptions against project records or physical works. In policy terms, little is known about the way councils translate audit recommendations into corrective action. The study will close these gaps by disaggregating the M&amp;E system into three measurable dimensions, by measuring performance on five verifiable indicators, and by combining regression with qualitative enquiry.</w:t>
       </w:r>
     </w:p>
     <w:p>
@@ -1597,27 +1457,7 @@
           <w:color w:val="000000"/>
           <w:sz w:val="24"/>
         </w:rPr>
-        <w:t xml:space="preserve">The National Policy on Decentralisation by Devolution requires councils to plan, implement and account for local development, with PO-RALG providing oversight (URT, 2000), and the Local Government (District Authorities) Act No. 7 of 1982 confers the council's mandate over local services and projects (URT, 1982). The PO-RALG assessment of D by D implementation found a shift of powers to regions and sector ministries, heavy dependence on earmarked transfers and weakened local oversight, which constrain a council's ability to monitor and correct its own projects (Lyon </w:t>
-      </w:r>
-      <w:r>
-        <w:rPr>
-          <w:rFonts w:ascii="Times New Roman" w:hAnsi="Times New Roman" w:cs="Times New Roman" w:eastAsia="Times New Roman"/>
-          <w:b w:val="0"/>
-          <w:i/>
-          <w:color w:val="000000"/>
-          <w:sz w:val="24"/>
-        </w:rPr>
-        <w:t>et al.</w:t>
-      </w:r>
-      <w:r>
-        <w:rPr>
-          <w:rFonts w:ascii="Times New Roman" w:hAnsi="Times New Roman" w:cs="Times New Roman" w:eastAsia="Times New Roman"/>
-          <w:b w:val="0"/>
-          <w:i w:val="0"/>
-          <w:color w:val="000000"/>
-          <w:sz w:val="24"/>
-        </w:rPr>
-        <w:t>, 2017). The Third National Five Year Development Plan for 2021/22-2025/26 commits government to strengthening implementation, monitoring and evaluation (URT, 2021), while the audit reports tabled in April 2026 recommend stronger management of public projects so that they are delivered on time, meet quality standards and remain within controlled costs (CAG, 2026). At local level, the Lushoto District Council Strategic Plan for 2015/16-2019/20 contains a monitoring and assessment component and sets sector targets including the improvement of management and governance systems, providing the local policy basis for examining M&amp;E arrangements and project performance (Lushoto District Council, 2015).</w:t>
+        <w:t>The National Policy on Decentralisation by Devolution requires councils to plan, to implement and to account for local development, and it assigns oversight to PO-RALG (URT, 2000). The Local Government (District Authorities) Act No. 7 of 1982 confers the council's mandate over local services and projects (URT, 1982). The Third Five Year Development Plan for 2021/22 to 2025/26 commits the government to stronger implementation, monitoring and evaluation (URT, 2021), and the audit reports tabled in April 2026 recommend stronger management of public projects so that they are delivered on time and within controlled costs (CAG, 2026). Mwaijande et al. (2026) reported that Tanzania still lacks a national evaluation policy. At the local level, the Lushoto District Strategic Plan for 2015/16 to 2019/20 contains a monitoring and assessment component and sets targets for management and governance systems, so it provides the policy basis against which the study will examine M&amp;E arrangements and project performance (Lushoto District Council, 2015).</w:t>
       </w:r>
     </w:p>
     <w:p>
@@ -1671,7 +1511,7 @@
           <w:color w:val="000000"/>
           <w:sz w:val="24"/>
         </w:rPr>
-        <w:t>This chapter describes the research design, study area, study population, sample size, sampling procedure, methods of data collection, data analysis and ethical considerations, with the reason for each choice supported by methodological literature.</w:t>
+        <w:t>This chapter describes the research design, the study area, the population, the sample, the sampling procedure, the data collection methods, the data analysis and the ethical considerations.</w:t>
       </w:r>
     </w:p>
     <w:p>
@@ -1707,7 +1547,7 @@
           <w:color w:val="000000"/>
           <w:sz w:val="24"/>
         </w:rPr>
-        <w:t>The study will adopt an explanatory sequential mixed-methods design embedded in a cross-sectional survey and a single case study of Lushoto District Council. The quantitative strand will be conducted first through a survey of M&amp;E stakeholders, and the qualitative strand will follow through key informant interviews, focus group discussions, document review and site observation to explain the results. Mixed methods are chosen because M&amp;E performance questions involve both measurable relationships and context-specific explanations, and because combining survey, qualitative and documentary evidence increases validity in development settings (Creswell, 2014).</w:t>
+        <w:t>The study will adopt an explanatory sequential mixed-methods design embedded in a cross-sectional survey and in a single case study of Lushoto District Council. The quantitative strand will run first through a survey of M&amp;E stakeholders, and the qualitative strand will follow through key informant interviews, focus group discussions, document review and site observation to explain the results. Mixed methods suit this study because M&amp;E performance questions involve both measurable relationships and context-specific explanations, and because the combination of survey data with documentary evidence increases validity in development settings (Creswell, 2014).</w:t>
       </w:r>
     </w:p>
     <w:p>
@@ -1743,7 +1583,7 @@
           <w:color w:val="000000"/>
           <w:sz w:val="24"/>
         </w:rPr>
-        <w:t>The study will be conducted in Lushoto District Council of Tanga Region, in the Usambara Mountains, covering 3,297 square kilometres and bordered by Kenya, Muheza, Korogwe and Bumbuli Districts and Kilimanjaro Region, with Lushoto town as its headquarters; it had 350,958 residents in 2022 (NBS, 2022). The economy is dominated by smallholder horticulture, dairy, forestry and tourism, and the council implements a large portfolio of water, classroom, health facility, road and market projects. Lushoto was chosen because it is a typical rural mountain council with a diverse project portfolio whose strategic plan sets explicit monitoring and governance targets, because reported delays and under-utilisation make it an information-rich case, and because the researcher's familiarity with the area eases entry.</w:t>
+        <w:t>The study will be conducted in Lushoto District Council of Tanga Region. The district lies in the Usambara Mountains, covers 3,297 square kilometres and has Lushoto town as its headquarters. It served 350,958 residents in 2022 (NBS, 2022). The economy rests on smallholder horticulture, dairy, forestry and tourism, and the council implements a large portfolio of water, classroom, health facility, road and market projects. Lushoto was chosen because it is a typical rural mountain council with a diverse project portfolio, because its strategic plan sets explicit monitoring and governance targets, and because reported delays make it an information-rich case.</w:t>
       </w:r>
     </w:p>
     <w:p>
@@ -1779,7 +1619,7 @@
           <w:color w:val="000000"/>
           <w:sz w:val="24"/>
         </w:rPr>
-        <w:t>The study population will comprise all categories of persons who plan, execute, supervise, finance, benefit from or oversee the M&amp;E of council projects. The estimated target population of 1,087 individuals was derived from council establishment records, ward and village committee registers and the contractors' register, and will be confirmed with the Council at the entry meeting.</w:t>
+        <w:t>The study population will comprise all persons who plan, execute, supervise, finance, benefit from or oversee the M&amp;E of council projects. The target population of 1,087 individuals was derived from council establishment records, from ward and village committee registers and from the register of contractors.</w:t>
       </w:r>
     </w:p>
     <w:p>
@@ -1815,7 +1655,7 @@
           <w:color w:val="000000"/>
           <w:sz w:val="24"/>
         </w:rPr>
-        <w:t>The sample size will be determined using the Yamane formula, n = N/(1 + Ne²), where N is the target population and e is the precision level of 0.05 at 95% confidence (Yamane, 1967). With N = 1,087, n = 1,087/(1 + 1,087 × 0.0025) = 293 respondents. The formula is chosen because the population is finite and its size is known from council records, and a reserve of 10% (29 respondents) will be drawn from the same strata to replace non-responses. In addition, 12 key informants will be interviewed, four focus group discussions of eight to ten participants each will be held, and 12 project sites will be observed. Table 1 shows the population and the proportional allocation of the sample.</w:t>
+        <w:t>Sample size will follow the Yamane formula, n = N/(1 + Ne²), where N is the target population and e is the precision level of 0.05 at 95 per cent confidence (Yamane, 1967). With N = 1,087, n = 1,087/(1 + 1,087 × 0.0025) = 293 respondents. The formula suits a finite population of known size. A reserve of ten per cent, that is 29 respondents, will replace non-responses. In addition, 12 key informants will be interviewed, four focus group discussions of eight to ten participants each will be held, and 12 project sites will be observed. Table 1 shows the population and the proportional allocation of the sample.</w:t>
       </w:r>
     </w:p>
     <w:p>
@@ -2902,7 +2742,7 @@
           <w:color w:val="000000"/>
           <w:sz w:val="24"/>
         </w:rPr>
-        <w:t>A multistage procedure will be used. First, eight wards will be selected purposively on the basis of project portfolio size, the presence of completed and ongoing or stalled projects, and geographic spread across the lowland and mountain zones. Second, respondents will be stratified by the categories in Table 1 and the sample allocated proportionally. Third, individuals will be drawn from the council staff list, the ward and village committee registers and the contractors' register by simple random sampling using computer-generated random numbers. Fourth, key informants will be selected purposively: the Council Director, the planning and M&amp;E officer, the heads of the works, health, education and water departments, the internal auditor, two contractors and one development partner representative. Project sites will be purposively selected to cover the five sub-sectors and three implementation statuses.</w:t>
+        <w:t>A multistage sampling procedure will guide the selection of respondents and of sites. First, the researcher will select eight wards purposively on the basis of project portfolio size, of the presence of completed and of ongoing or stalled projects, and of geographic spread across the lowland and the mountain zones. Second, the researcher will stratify respondents by the categories in Table 1 and will allocate the sample proportionally. Third, the researcher will draw individuals from the council staff list, from ward and village committee registers and from the contractors' register by simple random sampling with computer-generated numbers. Fourth, the researcher will select key informants purposively, namely the Council Director, the planning and M&amp;E officer, four departmental heads, the internal auditor, two contractors and a development partner representative. Project sites will be selected purposively to cover the five sub-sectors and the three implementation statuses.</w:t>
       </w:r>
     </w:p>
     <w:p>
@@ -2938,7 +2778,7 @@
           <w:color w:val="000000"/>
           <w:sz w:val="24"/>
         </w:rPr>
-        <w:t>Both primary and secondary data will be collected. Primary quantitative data will be collected through a structured questionnaire with closed-ended items on a five-point Likert scale covering the three M&amp;E dimensions and project performance; the questionnaire is preferred because it reaches a large, dispersed sample at low cost and yields standardised data suitable for regression. Primary qualitative data will be collected through semi-structured interview guides for key informants and focus group discussion guides for ward and village project committees and beneficiaries, which allow probing of why projects are delayed and how M&amp;E information is used. An observation checklist will be used at the 12 sites to verify physical progress, workmanship and utilisation, and a document review checklist will cover the Council Strategic Plan, implementation reports, project M&amp;E plans and files, payment records, council minutes and audit reports; triangulation across these sources will strengthen validity (Creswell, 2014).</w:t>
+        <w:t>Both primary and secondary data will be collected. A structured questionnaire with closed-ended items on a five-point Likert scale will collect primary quantitative data on the three M&amp;E dimensions and on project performance. The questionnaire suits this study because it reaches a large and dispersed sample at low cost and yields standardised data for regression. Semi-structured interview guides and focus group discussion guides for ward and village project committees and beneficiaries will collect primary qualitative data, and they will allow the researcher to probe the reasons for delay and the use of M&amp;E information. An observation checklist will verify physical progress, workmanship and utilisation at the 12 sites, and a document review checklist will cover the District Strategic Plan, implementation reports, project M&amp;E plans and files, payment records and audit reports. Triangulation across these sources will strengthen validity (Creswell, 2014).</w:t>
       </w:r>
     </w:p>
     <w:p>
@@ -2956,7 +2796,7 @@
           <w:color w:val="000000"/>
           <w:sz w:val="24"/>
         </w:rPr>
-        <w:t>The instruments will be pilot tested with 30 respondents in a comparable council outside the study sample to check clarity, length and sequencing. Content validity will be secured by having the supervisor and two M&amp;E practitioners review the instruments against the objectives, and reliability will be assessed with Cronbach's alpha, a coefficient of 0.70 or above being acceptable.</w:t>
+        <w:t>The researcher will pilot test the instruments with 30 respondents in a comparable council outside the sample, and the supervisor with two M&amp;E practitioners will review them against the objectives to secure content validity; Cronbach's alpha of 0.70 or above will indicate acceptable reliability.</w:t>
       </w:r>
     </w:p>
     <w:p>
@@ -2992,7 +2832,7 @@
           <w:color w:val="000000"/>
           <w:sz w:val="24"/>
         </w:rPr>
-        <w:t>Quantitative data will be cleaned, coded and entered into the Statistical Package for the Social Sciences (SPSS) Version 27. Descriptive statistics – frequencies, percentages, means and standard deviations – will summarise respondent profiles and the level of each variable. Inferential analysis will use Pearson correlation for bivariate relationships and multiple linear regression to test the influence of the three M&amp;E dimensions on project performance using the model PP = β₀ + β₁MPP + β₂MHC + β₃SI + ε, where PP is project performance, MPP is M&amp;E planning practices, MHC is M&amp;E human resource capacity, SI is stakeholder involvement in M&amp;E, β₁ to β₃ are the coefficients and ε is the error term. Composite scores will be generated from the Likert items of each construct, assumptions will be tested for normality, multicollinearity (variance inflation factor below 10) and homoscedasticity, and hypotheses will be tested at a 5% significance level. Qualitative data will be transcribed, coded and analysed thematically against the specific objectives, and the two strands will then be integrated through triangulation.</w:t>
+        <w:t>Quantitative data will be cleaned, coded and entered into the Statistical Package for the Social Sciences (SPSS) Version 27. Descriptive statistics, namely frequencies, percentages, means and standard deviations, will summarise respondent profiles and the level of each variable. Inferential analysis will use Pearson correlation for bivariate relationships and multiple linear regression to test the influence of the three M&amp;E dimensions on project performance through the model PP = β₀ + β₁MPP + β₂MHC + β₃SI + ε, where PP is project performance, MPP is M&amp;E planning practices, MHC is M&amp;E human resource capacity, SI is stakeholder involvement in M&amp;E, β₁ to β₃ are the coefficients and ε is the error term. Composite scores will be generated from the Likert items of each construct; the assumptions of normality, of multicollinearity with a variance inflation factor below 10 and of homoscedasticity will be tested; and the hypotheses will be tested at a five per cent significance level. Qualitative data will be transcribed, coded and analysed thematically against the specific objectives, and the two strands will be integrated through triangulation.</w:t>
       </w:r>
     </w:p>
     <w:p>
@@ -3028,7 +2868,7 @@
           <w:color w:val="000000"/>
           <w:sz w:val="24"/>
         </w:rPr>
-        <w:t>The study will comply with the requirements set out in section 1.8: an introduction letter and research permission from PO-RALG, the Regional Commissioner, the District Commissioner and the Council Director will be obtained before data collection; informed consent will be sought from every respondent; anonymity will be protected by coding questionnaires; confidentiality will be maintained by reporting results in aggregate form so that no individual or contract can be identified; and the researcher will avoid fabrication, falsification and plagiarism.</w:t>
+        <w:t>The study will comply with the requirements which section 1.8 sets out. The researcher will obtain an introduction letter and research permission before data collection and will seek informed consent from every respondent. Coding of questionnaires will protect anonymity, and reporting in aggregate form will maintain confidentiality so that no individual or contract can be identified. The researcher will avoid fabrication, falsification and plagiarism.</w:t>
       </w:r>
     </w:p>
     <w:p>
@@ -6351,7 +6191,7 @@
           <w:color w:val="000000"/>
           <w:sz w:val="24"/>
         </w:rPr>
-        <w:t xml:space="preserve">Chebet Murei, M.L.; Kidombo, P.H.; Gakuu, P.C. (2017). Influence of monitoring and evaluation human resources capacity on performance of horticulture projects in Nakuru County, Kenya. </w:t>
+        <w:t xml:space="preserve">Ba, A. (2021). How to measure monitoring and evaluation system effectiveness? </w:t>
       </w:r>
       <w:r>
         <w:rPr>
@@ -6361,7 +6201,7 @@
           <w:color w:val="000000"/>
           <w:sz w:val="24"/>
         </w:rPr>
-        <w:t>IJRDO – Journal of Social Science and Humanities Research</w:t>
+        <w:t>African Evaluation Journal, 9</w:t>
       </w:r>
       <w:r>
         <w:rPr>
@@ -6371,7 +6211,7 @@
           <w:color w:val="000000"/>
           <w:sz w:val="24"/>
         </w:rPr>
-        <w:t xml:space="preserve"> 2 (11): 112-131.</w:t>
+        <w:t>(1), a553. https://doi.org/10.4102/aej.v9i1.553</w:t>
       </w:r>
     </w:p>
     <w:p>
@@ -6390,7 +6230,7 @@
           <w:color w:val="000000"/>
           <w:sz w:val="24"/>
         </w:rPr>
-        <w:t xml:space="preserve">Creswell, J.W. (2014). </w:t>
+        <w:t xml:space="preserve">Creswell, J. W. (2014). </w:t>
       </w:r>
       <w:r>
         <w:rPr>
@@ -6400,7 +6240,7 @@
           <w:color w:val="000000"/>
           <w:sz w:val="24"/>
         </w:rPr>
-        <w:t>Research Design: Qualitative, Quantitative and Mixed Methods Approaches</w:t>
+        <w:t>Research design: Qualitative, quantitative, and mixed methods approaches</w:t>
       </w:r>
       <w:r>
         <w:rPr>
@@ -6410,7 +6250,7 @@
           <w:color w:val="000000"/>
           <w:sz w:val="24"/>
         </w:rPr>
-        <w:t>. (4th ed.). Sage Publications, Thousand Oaks, 296pp.</w:t>
+        <w:t xml:space="preserve"> (4th ed.). Sage Publications.</w:t>
       </w:r>
     </w:p>
     <w:p>
@@ -6429,7 +6269,7 @@
           <w:color w:val="000000"/>
           <w:sz w:val="24"/>
         </w:rPr>
-        <w:t xml:space="preserve">Eisenhardt, K.M. (1989). Agency theory: an assessment and review. </w:t>
+        <w:t xml:space="preserve">Eisenhardt, K. M. (1989). Agency theory: An assessment and review. </w:t>
       </w:r>
       <w:r>
         <w:rPr>
@@ -6439,7 +6279,7 @@
           <w:color w:val="000000"/>
           <w:sz w:val="24"/>
         </w:rPr>
-        <w:t>Academy of Management Review</w:t>
+        <w:t>Academy of Management Review, 14</w:t>
       </w:r>
       <w:r>
         <w:rPr>
@@ -6449,7 +6289,7 @@
           <w:color w:val="000000"/>
           <w:sz w:val="24"/>
         </w:rPr>
-        <w:t xml:space="preserve"> 14 (1): 57-74.</w:t>
+        <w:t>(1), 57–74.</w:t>
       </w:r>
     </w:p>
     <w:p>
@@ -6468,7 +6308,7 @@
           <w:color w:val="000000"/>
           <w:sz w:val="24"/>
         </w:rPr>
-        <w:t xml:space="preserve">Freeman, R.E. (1984). </w:t>
+        <w:t xml:space="preserve">Freeman, R. E. (1984). </w:t>
       </w:r>
       <w:r>
         <w:rPr>
@@ -6478,7 +6318,7 @@
           <w:color w:val="000000"/>
           <w:sz w:val="24"/>
         </w:rPr>
-        <w:t>Strategic Management: A Stakeholder Approach</w:t>
+        <w:t>Strategic management: A stakeholder approach</w:t>
       </w:r>
       <w:r>
         <w:rPr>
@@ -6488,7 +6328,7 @@
           <w:color w:val="000000"/>
           <w:sz w:val="24"/>
         </w:rPr>
-        <w:t>. Pitman, Boston, 276pp.</w:t>
+        <w:t>. Pitman.</w:t>
       </w:r>
     </w:p>
     <w:p>
@@ -6507,7 +6347,7 @@
           <w:color w:val="000000"/>
           <w:sz w:val="24"/>
         </w:rPr>
-        <w:t xml:space="preserve">Herman, A.K. (2023). Factors influencing monitoring and evaluation planning on the performance of water supply projects in Dodoma City Council. </w:t>
+        <w:t xml:space="preserve">Herman, A. K. (2023). Factors influencing monitoring and evaluation planning on the performance of water supply projects in Dodoma City Council. </w:t>
       </w:r>
       <w:r>
         <w:rPr>
@@ -6517,7 +6357,7 @@
           <w:color w:val="000000"/>
           <w:sz w:val="24"/>
         </w:rPr>
-        <w:t>African Journal of Emerging Issues</w:t>
+        <w:t>African Journal of Emerging Issues, 5</w:t>
       </w:r>
       <w:r>
         <w:rPr>
@@ -6527,7 +6367,7 @@
           <w:color w:val="000000"/>
           <w:sz w:val="24"/>
         </w:rPr>
-        <w:t xml:space="preserve"> 5 (17): 104-121.</w:t>
+        <w:t>(17), 104–121.</w:t>
       </w:r>
     </w:p>
     <w:p>
@@ -6546,7 +6386,7 @@
           <w:color w:val="000000"/>
           <w:sz w:val="24"/>
         </w:rPr>
-        <w:t xml:space="preserve">Ika, L.A. (2009). Project success as a topic in project management journals. </w:t>
+        <w:t xml:space="preserve">Ika, L. A. (2009). Project success as a topic in project management journals. </w:t>
       </w:r>
       <w:r>
         <w:rPr>
@@ -6556,7 +6396,7 @@
           <w:color w:val="000000"/>
           <w:sz w:val="24"/>
         </w:rPr>
-        <w:t>Project Management Journal</w:t>
+        <w:t>Project Management Journal, 40</w:t>
       </w:r>
       <w:r>
         <w:rPr>
@@ -6566,7 +6406,7 @@
           <w:color w:val="000000"/>
           <w:sz w:val="24"/>
         </w:rPr>
-        <w:t xml:space="preserve"> 40 (4): 6-19.</w:t>
+        <w:t>(4), 6–19.</w:t>
       </w:r>
     </w:p>
     <w:p>
@@ -6585,7 +6425,7 @@
           <w:color w:val="000000"/>
           <w:sz w:val="24"/>
         </w:rPr>
-        <w:t xml:space="preserve">Katerengabo, B.; Gakuu, C.; Kidombo, H. (2023). Implementing project monitoring and evaluation plan with beneficiaries for improving performance: evidence from Tanzania Conditional Cash Transfer. </w:t>
+        <w:t xml:space="preserve">Kacou, K. P., Ika, L. A., &amp; Munro, L. T. (2022). Fifty years of capacity building: Taking stock and moving research forward. </w:t>
       </w:r>
       <w:r>
         <w:rPr>
@@ -6595,7 +6435,7 @@
           <w:color w:val="000000"/>
           <w:sz w:val="24"/>
         </w:rPr>
-        <w:t>International Journal of Sustainable Development Research</w:t>
+        <w:t>Public Administration and Development, 42</w:t>
       </w:r>
       <w:r>
         <w:rPr>
@@ -6605,7 +6445,7 @@
           <w:color w:val="000000"/>
           <w:sz w:val="24"/>
         </w:rPr>
-        <w:t xml:space="preserve"> 9 (1): 11-17.</w:t>
+        <w:t>(4), 215–232. https://doi.org/10.1002/pad.1993</w:t>
       </w:r>
     </w:p>
     <w:p>
@@ -6624,7 +6464,7 @@
           <w:color w:val="000000"/>
           <w:sz w:val="24"/>
         </w:rPr>
-        <w:t xml:space="preserve">Killo, P.N. (2022). </w:t>
+        <w:t xml:space="preserve">Katerengabo, B., Gakuu, C., &amp; Kidombo, H. (2023). Implementing project monitoring and evaluation plan with beneficiaries for improving performance: Evidence from Tanzania Conditional Cash Transfer. </w:t>
       </w:r>
       <w:r>
         <w:rPr>
@@ -6634,7 +6474,7 @@
           <w:color w:val="000000"/>
           <w:sz w:val="24"/>
         </w:rPr>
-        <w:t>Influence of Monitoring and Evaluation Practices on Performance of Tobacco Contract Farming Projects in Katavi Region, Tanzania</w:t>
+        <w:t>International Journal of Sustainable Development Research, 9</w:t>
       </w:r>
       <w:r>
         <w:rPr>
@@ -6644,7 +6484,7 @@
           <w:color w:val="000000"/>
           <w:sz w:val="24"/>
         </w:rPr>
-        <w:t>. Dissertation for the Award of PhD Degree at The Open University of Tanzania, Dar es Salaam, Tanzania.</w:t>
+        <w:t>(1), 11–17. https://doi.org/10.11648/j.ijsdr.20230901.12</w:t>
       </w:r>
     </w:p>
     <w:p>
@@ -6663,7 +6503,7 @@
           <w:color w:val="000000"/>
           <w:sz w:val="24"/>
         </w:rPr>
-        <w:t xml:space="preserve">Kusek, J.Z.; Rist, R.C. (2004). </w:t>
+        <w:t xml:space="preserve">Killo, P. N. (2022). </w:t>
       </w:r>
       <w:r>
         <w:rPr>
@@ -6673,7 +6513,7 @@
           <w:color w:val="000000"/>
           <w:sz w:val="24"/>
         </w:rPr>
-        <w:t>Ten Steps to a Results-Based Monitoring and Evaluation System: A Handbook for Development Practitioners</w:t>
+        <w:t>Influence of monitoring and evaluation practices on performance of tobacco contract farming projects in Katavi Region, Tanzania</w:t>
       </w:r>
       <w:r>
         <w:rPr>
@@ -6683,7 +6523,7 @@
           <w:color w:val="000000"/>
           <w:sz w:val="24"/>
         </w:rPr>
-        <w:t>. World Bank, Washington DC, 216pp.</w:t>
+        <w:t xml:space="preserve"> [Doctoral dissertation, The Open University of Tanzania].</w:t>
       </w:r>
     </w:p>
     <w:p>
@@ -6702,7 +6542,7 @@
           <w:color w:val="000000"/>
           <w:sz w:val="24"/>
         </w:rPr>
-        <w:t xml:space="preserve">Lushoto District Council (2015). </w:t>
+        <w:t xml:space="preserve">Kusek, J. Z., &amp; Rist, R. C. (2004). </w:t>
       </w:r>
       <w:r>
         <w:rPr>
@@ -6712,7 +6552,7 @@
           <w:color w:val="000000"/>
           <w:sz w:val="24"/>
         </w:rPr>
-        <w:t>District Council's Strategic Plan for the Period 2015-2020</w:t>
+        <w:t>Ten steps to a results-based monitoring and evaluation system: A handbook for development practitioners</w:t>
       </w:r>
       <w:r>
         <w:rPr>
@@ -6722,7 +6562,7 @@
           <w:color w:val="000000"/>
           <w:sz w:val="24"/>
         </w:rPr>
-        <w:t>. Lushoto District Council, Lushoto, Tanzania.</w:t>
+        <w:t>. World Bank.</w:t>
       </w:r>
     </w:p>
     <w:p>
@@ -6741,7 +6581,7 @@
           <w:color w:val="000000"/>
           <w:sz w:val="24"/>
         </w:rPr>
-        <w:t xml:space="preserve">Lyon, A.; Zilihona, I.; Masanyiwa, Z. (2017). </w:t>
+        <w:t xml:space="preserve">Kwareh, K. R., Mgale, Y. J., &amp; Rwela, T. G. (2024). Influence of monitoring and evaluation practices on performance of health projects: Evidence from SIKIKA project in Dodoma and Dar es Salaam, Tanzania. </w:t>
       </w:r>
       <w:r>
         <w:rPr>
@@ -6751,7 +6591,7 @@
           <w:color w:val="000000"/>
           <w:sz w:val="24"/>
         </w:rPr>
-        <w:t>Report on Assessment of Implementation of Decentralisation by Devolution in Tanzania</w:t>
+        <w:t>Open Access Library Journal, 11</w:t>
       </w:r>
       <w:r>
         <w:rPr>
@@ -6761,7 +6601,7 @@
           <w:color w:val="000000"/>
           <w:sz w:val="24"/>
         </w:rPr>
-        <w:t>. President's Office – Regional Administration and Local Government, Dodoma, Tanzania.</w:t>
+        <w:t>(6), e11470. https://doi.org/10.4236/oalib.1111470</w:t>
       </w:r>
     </w:p>
     <w:p>
@@ -6780,7 +6620,7 @@
           <w:color w:val="000000"/>
           <w:sz w:val="24"/>
         </w:rPr>
-        <w:t xml:space="preserve">Mackay, K. (2007). </w:t>
+        <w:t xml:space="preserve">Lushoto District Council. (2015). </w:t>
       </w:r>
       <w:r>
         <w:rPr>
@@ -6790,7 +6630,7 @@
           <w:color w:val="000000"/>
           <w:sz w:val="24"/>
         </w:rPr>
-        <w:t>Building Evaluation Capacity: Activities and Outcomes</w:t>
+        <w:t>District strategic plan 2015/16–2019/20</w:t>
       </w:r>
       <w:r>
         <w:rPr>
@@ -6800,7 +6640,7 @@
           <w:color w:val="000000"/>
           <w:sz w:val="24"/>
         </w:rPr>
-        <w:t>. World Bank, Washington DC, 232pp.</w:t>
+        <w:t>.</w:t>
       </w:r>
     </w:p>
     <w:p>
@@ -6819,7 +6659,7 @@
           <w:color w:val="000000"/>
           <w:sz w:val="24"/>
         </w:rPr>
-        <w:t xml:space="preserve">Maimula, S. (2017). </w:t>
+        <w:t xml:space="preserve">Mabizela, H., &amp; Zwane, Z. (2023). Monitoring and evaluation as critical approach to enhance the performance of local government: South Africa. </w:t>
       </w:r>
       <w:r>
         <w:rPr>
@@ -6829,7 +6669,7 @@
           <w:color w:val="000000"/>
           <w:sz w:val="24"/>
         </w:rPr>
-        <w:t>Challenges in Practicing Monitoring and Evaluation: The Case of Local Government Water Projects in Mkuranga, Tanzania</w:t>
+        <w:t>International Journal of Research in Business and Social Science, 12</w:t>
       </w:r>
       <w:r>
         <w:rPr>
@@ -6839,7 +6679,7 @@
           <w:color w:val="000000"/>
           <w:sz w:val="24"/>
         </w:rPr>
-        <w:t>. Dissertation for the Award of Master of Arts in Monitoring and Evaluation at The Open University of Tanzania, Dar es Salaam, Tanzania, 105pp.</w:t>
+        <w:t>(7), 74–84. https://doi.org/10.20525/ijrbs.v12i7.2746</w:t>
       </w:r>
     </w:p>
     <w:p>
@@ -6858,7 +6698,7 @@
           <w:color w:val="000000"/>
           <w:sz w:val="24"/>
         </w:rPr>
-        <w:t xml:space="preserve">Mgoba, S.A.; Kabote, S.J. (2020). Effectiveness of participatory monitoring and evaluation on achievement of community-based water projects in Tanzania. </w:t>
+        <w:t xml:space="preserve">Masvaure, S., &amp; Fish, T. E. (2022). Strengthening and measuring monitoring and evaluation capacity in selected African programmes. </w:t>
       </w:r>
       <w:r>
         <w:rPr>
@@ -6868,7 +6708,7 @@
           <w:color w:val="000000"/>
           <w:sz w:val="24"/>
         </w:rPr>
-        <w:t>Applied Water Science</w:t>
+        <w:t>African Evaluation Journal, 10</w:t>
       </w:r>
       <w:r>
         <w:rPr>
@@ -6878,7 +6718,7 @@
           <w:color w:val="000000"/>
           <w:sz w:val="24"/>
         </w:rPr>
-        <w:t xml:space="preserve"> 10: 200.</w:t>
+        <w:t>(1), a635. https://doi.org/10.4102/aej.v10i1.635</w:t>
       </w:r>
     </w:p>
     <w:p>
@@ -6897,7 +6737,7 @@
           <w:color w:val="000000"/>
           <w:sz w:val="24"/>
         </w:rPr>
-        <w:t xml:space="preserve">Mhina, G. (2017). </w:t>
+        <w:t xml:space="preserve">Mgoba, S. A., &amp; Kabote, S. J. (2020). Effectiveness of participatory monitoring and evaluation on achievement of community-based water projects in Tanzania. </w:t>
       </w:r>
       <w:r>
         <w:rPr>
@@ -6907,7 +6747,7 @@
           <w:color w:val="000000"/>
           <w:sz w:val="24"/>
         </w:rPr>
-        <w:t>Monitoring and Evaluation Practices and their Effects in District Councils: A Case of Ruvuma Region</w:t>
+        <w:t>Applied Water Science, 10</w:t>
       </w:r>
       <w:r>
         <w:rPr>
@@ -6917,7 +6757,7 @@
           <w:color w:val="000000"/>
           <w:sz w:val="24"/>
         </w:rPr>
-        <w:t>. Dissertation for the Award of Master's Degree at Mzumbe University, Morogoro, Tanzania.</w:t>
+        <w:t>, Article 200.</w:t>
       </w:r>
     </w:p>
     <w:p>
@@ -6936,7 +6776,7 @@
           <w:color w:val="000000"/>
           <w:sz w:val="24"/>
         </w:rPr>
-        <w:t xml:space="preserve">National Bureau of Statistics (2022). </w:t>
+        <w:t xml:space="preserve">Mwaijande, F., Kengera, Z., &amp; Nguliki, I. M. (2026). Evaluation in Tanzania. In R. Stockmann, W. Meyer, &amp; T. Stockmann (Eds.), </w:t>
       </w:r>
       <w:r>
         <w:rPr>
@@ -6946,7 +6786,7 @@
           <w:color w:val="000000"/>
           <w:sz w:val="24"/>
         </w:rPr>
-        <w:t>The 2022 Population and Housing Census: Administrative Units Population Distribution Report</w:t>
+        <w:t>The institutionalisation of evaluation in Africa</w:t>
       </w:r>
       <w:r>
         <w:rPr>
@@ -6956,7 +6796,7 @@
           <w:color w:val="000000"/>
           <w:sz w:val="24"/>
         </w:rPr>
-        <w:t>. National Bureau of Statistics, Dodoma, Tanzania.</w:t>
+        <w:t xml:space="preserve"> (pp. 255–285). Palgrave Macmillan. https://doi.org/10.1007/978-3-032-06301-4_10</w:t>
       </w:r>
     </w:p>
     <w:p>
@@ -6975,7 +6815,7 @@
           <w:color w:val="000000"/>
           <w:sz w:val="24"/>
         </w:rPr>
-        <w:t xml:space="preserve">Okeyo, E.O.; Mogusu, J.; Ombachi, N.K. (2019). Effectiveness of monitoring and evaluation structure on the performance of county government projects in the Lake Region Economic Bloc of Nyanza, Kenya. </w:t>
+        <w:t xml:space="preserve">National Bureau of Statistics. (2022). </w:t>
       </w:r>
       <w:r>
         <w:rPr>
@@ -6985,7 +6825,7 @@
           <w:color w:val="000000"/>
           <w:sz w:val="24"/>
         </w:rPr>
-        <w:t>International Journal of Scientific and Research Publications</w:t>
+        <w:t>The 2022 population and housing census: Administrative units population distribution report</w:t>
       </w:r>
       <w:r>
         <w:rPr>
@@ -6995,7 +6835,7 @@
           <w:color w:val="000000"/>
           <w:sz w:val="24"/>
         </w:rPr>
-        <w:t xml:space="preserve"> 9 (3): 691-699.</w:t>
+        <w:t>.</w:t>
       </w:r>
     </w:p>
     <w:p>
@@ -7014,7 +6854,7 @@
           <w:color w:val="000000"/>
           <w:sz w:val="24"/>
         </w:rPr>
-        <w:t xml:space="preserve">Office of the Controller and Auditor General (2026). </w:t>
+        <w:t xml:space="preserve">Ochen-Ochen, I. (2025). The politics of monitoring and evaluation: Implications for evidence generation and use. </w:t>
       </w:r>
       <w:r>
         <w:rPr>
@@ -7024,7 +6864,7 @@
           <w:color w:val="000000"/>
           <w:sz w:val="24"/>
         </w:rPr>
-        <w:t>Media Statement on the Annual General Reports of the Controller and Auditor General, 14 April 2026</w:t>
+        <w:t>African Evaluation Journal, 13</w:t>
       </w:r>
       <w:r>
         <w:rPr>
@@ -7034,7 +6874,7 @@
           <w:color w:val="000000"/>
           <w:sz w:val="24"/>
         </w:rPr>
-        <w:t>. National Audit Office of Tanzania, Dodoma. [https://www.nao.go.tz/uploads/Media_Statement_-_English.pdf] site visited on 16/9/2026.</w:t>
+        <w:t>(1), a792. https://doi.org/10.4102/aej.v13i1.792</w:t>
       </w:r>
     </w:p>
     <w:p>
@@ -7053,7 +6893,7 @@
           <w:color w:val="000000"/>
           <w:sz w:val="24"/>
         </w:rPr>
-        <w:t xml:space="preserve">Organisation for Economic Co-operation and Development (2010). </w:t>
+        <w:t xml:space="preserve">Office of the Controller and Auditor General. (2026). </w:t>
       </w:r>
       <w:r>
         <w:rPr>
@@ -7063,7 +6903,7 @@
           <w:color w:val="000000"/>
           <w:sz w:val="24"/>
         </w:rPr>
-        <w:t>Glossary of Key Terms in Evaluation and Results Based Management</w:t>
+        <w:t>Media statement on the annual general reports of the Controller and Auditor General, 14 April 2026</w:t>
       </w:r>
       <w:r>
         <w:rPr>
@@ -7073,7 +6913,7 @@
           <w:color w:val="000000"/>
           <w:sz w:val="24"/>
         </w:rPr>
-        <w:t>. (2nd ed.). OECD Publishing, Paris, 46pp.</w:t>
+        <w:t>. National Audit Office of Tanzania. https://www.nao.go.tz/uploads/Media_Statement_-_English.pdf</w:t>
       </w:r>
     </w:p>
     <w:p>
@@ -7092,7 +6932,85 @@
           <w:color w:val="000000"/>
           <w:sz w:val="24"/>
         </w:rPr>
-        <w:t xml:space="preserve">United Republic of Tanzania (1982). </w:t>
+        <w:t xml:space="preserve">Organisation for Economic Co-operation and Development. (2010). </w:t>
+      </w:r>
+      <w:r>
+        <w:rPr>
+          <w:rFonts w:ascii="Times New Roman" w:hAnsi="Times New Roman" w:cs="Times New Roman" w:eastAsia="Times New Roman"/>
+          <w:b w:val="0"/>
+          <w:i/>
+          <w:color w:val="000000"/>
+          <w:sz w:val="24"/>
+        </w:rPr>
+        <w:t>Glossary of key terms in evaluation and results based management</w:t>
+      </w:r>
+      <w:r>
+        <w:rPr>
+          <w:rFonts w:ascii="Times New Roman" w:hAnsi="Times New Roman" w:cs="Times New Roman" w:eastAsia="Times New Roman"/>
+          <w:b w:val="0"/>
+          <w:i w:val="0"/>
+          <w:color w:val="000000"/>
+          <w:sz w:val="24"/>
+        </w:rPr>
+        <w:t xml:space="preserve"> (2nd ed.). OECD Publishing.</w:t>
+      </w:r>
+    </w:p>
+    <w:p>
+      <w:pPr>
+        <w:keepNext w:val="0"/>
+        <w:widowControl/>
+        <w:spacing w:line="480" w:lineRule="auto" w:before="0" w:after="0"/>
+        <w:ind w:left="720" w:hanging="720"/>
+        <w:jc w:val="left"/>
+      </w:pPr>
+      <w:r>
+        <w:rPr>
+          <w:rFonts w:ascii="Times New Roman" w:hAnsi="Times New Roman" w:cs="Times New Roman" w:eastAsia="Times New Roman"/>
+          <w:b w:val="0"/>
+          <w:i w:val="0"/>
+          <w:color w:val="000000"/>
+          <w:sz w:val="24"/>
+        </w:rPr>
+        <w:t xml:space="preserve">Rugeiyamu, R. (2024). Implementation of Tanzania’s Development Vision 2025: Local government authorities’ endeavours and challenges. </w:t>
+      </w:r>
+      <w:r>
+        <w:rPr>
+          <w:rFonts w:ascii="Times New Roman" w:hAnsi="Times New Roman" w:cs="Times New Roman" w:eastAsia="Times New Roman"/>
+          <w:b w:val="0"/>
+          <w:i/>
+          <w:color w:val="000000"/>
+          <w:sz w:val="24"/>
+        </w:rPr>
+        <w:t>Commonwealth Journal of Local Governance, 29</w:t>
+      </w:r>
+      <w:r>
+        <w:rPr>
+          <w:rFonts w:ascii="Times New Roman" w:hAnsi="Times New Roman" w:cs="Times New Roman" w:eastAsia="Times New Roman"/>
+          <w:b w:val="0"/>
+          <w:i w:val="0"/>
+          <w:color w:val="000000"/>
+          <w:sz w:val="24"/>
+        </w:rPr>
+        <w:t>, 113–129. https://doi.org/10.5130/cjlg.vi29.8443</w:t>
+      </w:r>
+    </w:p>
+    <w:p>
+      <w:pPr>
+        <w:keepNext w:val="0"/>
+        <w:widowControl/>
+        <w:spacing w:line="480" w:lineRule="auto" w:before="0" w:after="0"/>
+        <w:ind w:left="720" w:hanging="720"/>
+        <w:jc w:val="left"/>
+      </w:pPr>
+      <w:r>
+        <w:rPr>
+          <w:rFonts w:ascii="Times New Roman" w:hAnsi="Times New Roman" w:cs="Times New Roman" w:eastAsia="Times New Roman"/>
+          <w:b w:val="0"/>
+          <w:i w:val="0"/>
+          <w:color w:val="000000"/>
+          <w:sz w:val="24"/>
+        </w:rPr>
+        <w:t xml:space="preserve">United Republic of Tanzania. (1982). </w:t>
       </w:r>
       <w:r>
         <w:rPr>
@@ -7112,7 +7030,7 @@
           <w:color w:val="000000"/>
           <w:sz w:val="24"/>
         </w:rPr>
-        <w:t>. Government Printer, Dar es Salaam, Tanzania.</w:t>
+        <w:t>. Government Printer.</w:t>
       </w:r>
     </w:p>
     <w:p>
@@ -7131,7 +7049,7 @@
           <w:color w:val="000000"/>
           <w:sz w:val="24"/>
         </w:rPr>
-        <w:t xml:space="preserve">United Republic of Tanzania (2000). </w:t>
+        <w:t xml:space="preserve">United Republic of Tanzania. (2000). </w:t>
       </w:r>
       <w:r>
         <w:rPr>
@@ -7141,7 +7059,7 @@
           <w:color w:val="000000"/>
           <w:sz w:val="24"/>
         </w:rPr>
-        <w:t>National Policy on Decentralisation by Devolution</w:t>
+        <w:t>National policy on decentralisation by devolution</w:t>
       </w:r>
       <w:r>
         <w:rPr>
@@ -7151,7 +7069,7 @@
           <w:color w:val="000000"/>
           <w:sz w:val="24"/>
         </w:rPr>
-        <w:t>. President's Office – Regional Administration and Local Government, Dodoma, Tanzania.</w:t>
+        <w:t>. President’s Office – Regional Administration and Local Government.</w:t>
       </w:r>
     </w:p>
     <w:p>
@@ -7170,7 +7088,7 @@
           <w:color w:val="000000"/>
           <w:sz w:val="24"/>
         </w:rPr>
-        <w:t xml:space="preserve">United Republic of Tanzania (2021). </w:t>
+        <w:t xml:space="preserve">United Republic of Tanzania. (2021). </w:t>
       </w:r>
       <w:r>
         <w:rPr>
@@ -7180,7 +7098,7 @@
           <w:color w:val="000000"/>
           <w:sz w:val="24"/>
         </w:rPr>
-        <w:t>National Five Year Development Plan FYDP III 2021/22-2025/26: Realising Competitiveness and Industrialisation for Human Development</w:t>
+        <w:t>National Five Year Development Plan FYDP III 2021/22–2025/26: Realising competitiveness and industrialisation for human development</w:t>
       </w:r>
       <w:r>
         <w:rPr>
@@ -7190,7 +7108,7 @@
           <w:color w:val="000000"/>
           <w:sz w:val="24"/>
         </w:rPr>
-        <w:t>. Ministry of Finance and Planning, Dodoma, Tanzania.</w:t>
+        <w:t>. Ministry of Finance and Planning.</w:t>
       </w:r>
     </w:p>
     <w:p>
@@ -7219,7 +7137,7 @@
           <w:color w:val="000000"/>
           <w:sz w:val="24"/>
         </w:rPr>
-        <w:t>Statistics: An Introductory Analysis</w:t>
+        <w:t>Statistics: An introductory analysis</w:t>
       </w:r>
       <w:r>
         <w:rPr>
@@ -7229,7 +7147,7 @@
           <w:color w:val="000000"/>
           <w:sz w:val="24"/>
         </w:rPr>
-        <w:t>. (2nd ed.). Harper and Row, New York, 919pp.</w:t>
+        <w:t xml:space="preserve"> (2nd ed.). Harper and Row.</w:t>
       </w:r>
     </w:p>
     <w:sectPr>

</xml_diff>